<commit_message>
Enact champion compensation restrictions and approve BT Charlie deal
</commit_message>
<xml_diff>
--- a/docs/rules/ultimate-guillotine-gulag-league-rules.docx
+++ b/docs/rules/ultimate-guillotine-gulag-league-rules.docx
@@ -388,6 +388,112 @@
           <w:rtl w:val="0"/>
         </w:rPr>
         <w:t xml:space="preserve">You can pay someone else to take your place as your champion in either Gulag or Gladiator. That player will have to take the gulag penalty (dropping players)</w:t>
+      </w:r>
+    </w:p>
+    <w:p>
+      <w:pPr>
+        <w:keepNext/>
+        <w:numPr>
+          <w:ilvl w:val="0"/>
+          <w:numId w:val="4"/>
+        </w:numPr>
+        <w:spacing w:after="0" w:afterAutospacing="0" w:before="0" w:beforeAutospacing="0" w:line="240" w:lineRule="auto"/>
+        <w:ind w:left="720" w:hanging="360"/>
+        <w:rPr>
+          <w:rFonts w:ascii="EB Garamond" w:cs="EB Garamond" w:eastAsia="EB Garamond" w:hAnsi="EB Garamond"/>
+        </w:rPr>
+      </w:pPr>
+      <w:r>
+        <w:rPr>
+          <w:rFonts w:ascii="EB Garamond" w:cs="EB Garamond" w:eastAsia="EB Garamond" w:hAnsi="EB Garamond"/>
+          <w:b/>
+          <w:rtl w:val="0"/>
+        </w:rPr>
+        <w:t>Gulag champion ruling effective October 20, 2026</w:t>
+      </w:r>
+    </w:p>
+    <w:p>
+      <w:pPr>
+        <w:keepNext w:val="0"/>
+        <w:numPr>
+          <w:ilvl w:val="0"/>
+          <w:numId w:val="4"/>
+        </w:numPr>
+        <w:spacing w:after="0" w:afterAutospacing="0" w:before="0" w:beforeAutospacing="0" w:line="240" w:lineRule="auto"/>
+        <w:ind w:left="720" w:hanging="360"/>
+        <w:rPr>
+          <w:rFonts w:ascii="EB Garamond" w:cs="EB Garamond" w:eastAsia="EB Garamond" w:hAnsi="EB Garamond"/>
+        </w:rPr>
+      </w:pPr>
+      <w:r>
+        <w:rPr>
+          <w:rFonts w:ascii="EB Garamond" w:cs="EB Garamond" w:eastAsia="EB Garamond" w:hAnsi="EB Garamond"/>
+          <w:rtl w:val="0"/>
+        </w:rPr>
+        <w:t>Charlie vs League Balancing Committee: The BT-Charlie champion trade as announced is fully legal under the rules in force when it was made and is not league-breaking. It is approved as agreed, especially since the Gulag opponent accepts it. The new restrictions below apply moving forward and do not invalidate this trade.</w:t>
+      </w:r>
+    </w:p>
+    <w:p>
+      <w:pPr>
+        <w:keepNext w:val="0"/>
+        <w:numPr>
+          <w:ilvl w:val="0"/>
+          <w:numId w:val="4"/>
+        </w:numPr>
+        <w:spacing w:after="0" w:afterAutospacing="0" w:before="0" w:beforeAutospacing="0" w:line="240" w:lineRule="auto"/>
+        <w:ind w:left="720" w:hanging="360"/>
+        <w:rPr>
+          <w:rFonts w:ascii="EB Garamond" w:cs="EB Garamond" w:eastAsia="EB Garamond" w:hAnsi="EB Garamond"/>
+        </w:rPr>
+      </w:pPr>
+      <w:r>
+        <w:rPr>
+          <w:rFonts w:ascii="EB Garamond" w:cs="EB Garamond" w:eastAsia="EB Garamond" w:hAnsi="EB Garamond"/>
+          <w:rtl w:val="0"/>
+        </w:rPr>
+        <w:t>The trade nevertheless creates a precedent for more abusive champion deals that extract value from assets a Gulag-bound team would otherwise be guaranteed to lose through required roster cuts.</w:t>
+      </w:r>
+    </w:p>
+    <w:p>
+      <w:pPr>
+        <w:keepNext w:val="0"/>
+        <w:numPr>
+          <w:ilvl w:val="0"/>
+          <w:numId w:val="4"/>
+        </w:numPr>
+        <w:spacing w:after="0" w:afterAutospacing="0" w:before="0" w:beforeAutospacing="0" w:line="240" w:lineRule="auto"/>
+        <w:ind w:left="720" w:hanging="360"/>
+        <w:rPr>
+          <w:rFonts w:ascii="EB Garamond" w:cs="EB Garamond" w:eastAsia="EB Garamond" w:hAnsi="EB Garamond"/>
+        </w:rPr>
+      </w:pPr>
+      <w:r>
+        <w:rPr>
+          <w:rFonts w:ascii="EB Garamond" w:cs="EB Garamond" w:eastAsia="EB Garamond" w:hAnsi="EB Garamond"/>
+          <w:rtl w:val="0"/>
+        </w:rPr>
+        <w:t>For future Gulag champion agreements, a champion may be paid only with assets the appointing team would be entitled to keep going into that week: money/FAAB and available keeper players. Players the appointing team would otherwise be required to cut cannot be used as champion compensation.</w:t>
+      </w:r>
+    </w:p>
+    <w:p>
+      <w:pPr>
+        <w:keepNext w:val="0"/>
+        <w:numPr>
+          <w:ilvl w:val="0"/>
+          <w:numId w:val="4"/>
+        </w:numPr>
+        <w:spacing w:after="0" w:afterAutospacing="0" w:before="0" w:beforeAutospacing="0" w:line="240" w:lineRule="auto"/>
+        <w:ind w:left="720" w:hanging="360"/>
+        <w:rPr>
+          <w:rFonts w:ascii="EB Garamond" w:cs="EB Garamond" w:eastAsia="EB Garamond" w:hAnsi="EB Garamond"/>
+        </w:rPr>
+      </w:pPr>
+      <w:r>
+        <w:rPr>
+          <w:rFonts w:ascii="EB Garamond" w:cs="EB Garamond" w:eastAsia="EB Garamond" w:hAnsi="EB Garamond"/>
+          <w:rtl w:val="0"/>
+        </w:rPr>
+        <w:t>During that Gulag appearance, the champion cannot receive any further compensation or enter into any further deals with the team that appointed them.</w:t>
       </w:r>
     </w:p>
     <w:p>

</xml_diff>